<commit_message>
Changes prior to presentation.
</commit_message>
<xml_diff>
--- a/AI presentation/Learning_About_AI_Key_Vocabulary.docx
+++ b/AI presentation/Learning_About_AI_Key_Vocabulary.docx
@@ -306,6 +306,60 @@
                 <w:sz w:val="20"/>
                 <w:szCs w:val="20"/>
               </w:rPr>
+              <w:t xml:space="preserve">Context</w:t>
+            </w:r>
+          </w:p>
+        </w:tc>
+        <w:tc>
+          <w:tcPr>
+            <w:tcW w:type="dxa" w:w="6840"/>
+            <w:tcMar>
+              <w:top w:type="dxa" w:w="80"/>
+              <w:bottom w:type="dxa" w:w="80"/>
+            </w:tcMar>
+            <w:vAlign w:val="center"/>
+          </w:tcPr>
+          <w:p>
+            <w:pPr>
+              <w:spacing w:after="0" w:before="0" w:line="275"/>
+            </w:pPr>
+            <w:r>
+              <w:rPr>
+                <w:rFonts w:ascii="Calibri" w:cs="Calibri" w:eastAsia="Calibri" w:hAnsi="Calibri"/>
+                <w:b w:val="false"/>
+                <w:bCs w:val="false"/>
+                <w:color w:val="111827"/>
+                <w:sz w:val="20"/>
+                <w:szCs w:val="20"/>
+              </w:rPr>
+              <w:t xml:space="preserve">The information a model is given or can consider while producing a response, such as the conversation so far, instructions, a document, or a question.</w:t>
+            </w:r>
+          </w:p>
+        </w:tc>
+      </w:tr>
+      <w:tr>
+        <w:tc>
+          <w:tcPr>
+            <w:tcW w:type="dxa" w:w="2520"/>
+            <w:tcMar>
+              <w:top w:type="dxa" w:w="80"/>
+              <w:bottom w:type="dxa" w:w="80"/>
+            </w:tcMar>
+            <w:vAlign w:val="center"/>
+          </w:tcPr>
+          <w:p>
+            <w:pPr>
+              <w:spacing w:after="0" w:before="0" w:line="275"/>
+            </w:pPr>
+            <w:r>
+              <w:rPr>
+                <w:rFonts w:ascii="Calibri" w:cs="Calibri" w:eastAsia="Calibri" w:hAnsi="Calibri"/>
+                <w:b/>
+                <w:bCs/>
+                <w:color w:val="111827"/>
+                <w:sz w:val="20"/>
+                <w:szCs w:val="20"/>
+              </w:rPr>
               <w:t xml:space="preserve">Context window</w:t>
             </w:r>
           </w:p>
@@ -792,6 +846,60 @@
                 <w:sz w:val="20"/>
                 <w:szCs w:val="20"/>
               </w:rPr>
+              <w:t xml:space="preserve">Inputs</w:t>
+            </w:r>
+          </w:p>
+        </w:tc>
+        <w:tc>
+          <w:tcPr>
+            <w:tcW w:type="dxa" w:w="6840"/>
+            <w:tcMar>
+              <w:top w:type="dxa" w:w="80"/>
+              <w:bottom w:type="dxa" w:w="80"/>
+            </w:tcMar>
+            <w:vAlign w:val="center"/>
+          </w:tcPr>
+          <w:p>
+            <w:pPr>
+              <w:spacing w:after="0" w:before="0" w:line="275"/>
+            </w:pPr>
+            <w:r>
+              <w:rPr>
+                <w:rFonts w:ascii="Calibri" w:cs="Calibri" w:eastAsia="Calibri" w:hAnsi="Calibri"/>
+                <w:b w:val="false"/>
+                <w:bCs w:val="false"/>
+                <w:color w:val="111827"/>
+                <w:sz w:val="20"/>
+                <w:szCs w:val="20"/>
+              </w:rPr>
+              <w:t xml:space="preserve">The information supplied to an AI system for it to process, such as a prompt, uploaded document, image, audio recording, or data from a tool.</w:t>
+            </w:r>
+          </w:p>
+        </w:tc>
+      </w:tr>
+      <w:tr>
+        <w:tc>
+          <w:tcPr>
+            <w:tcW w:type="dxa" w:w="2520"/>
+            <w:tcMar>
+              <w:top w:type="dxa" w:w="80"/>
+              <w:bottom w:type="dxa" w:w="80"/>
+            </w:tcMar>
+            <w:vAlign w:val="center"/>
+          </w:tcPr>
+          <w:p>
+            <w:pPr>
+              <w:spacing w:after="0" w:before="0" w:line="275"/>
+            </w:pPr>
+            <w:r>
+              <w:rPr>
+                <w:rFonts w:ascii="Calibri" w:cs="Calibri" w:eastAsia="Calibri" w:hAnsi="Calibri"/>
+                <w:b/>
+                <w:bCs/>
+                <w:color w:val="111827"/>
+                <w:sz w:val="20"/>
+                <w:szCs w:val="20"/>
+              </w:rPr>
               <w:t xml:space="preserve">Language model</w:t>
             </w:r>
           </w:p>
@@ -900,6 +1008,60 @@
                 <w:sz w:val="20"/>
                 <w:szCs w:val="20"/>
               </w:rPr>
+              <w:t xml:space="preserve">Model</w:t>
+            </w:r>
+          </w:p>
+        </w:tc>
+        <w:tc>
+          <w:tcPr>
+            <w:tcW w:type="dxa" w:w="6840"/>
+            <w:tcMar>
+              <w:top w:type="dxa" w:w="80"/>
+              <w:bottom w:type="dxa" w:w="80"/>
+            </w:tcMar>
+            <w:vAlign w:val="center"/>
+          </w:tcPr>
+          <w:p>
+            <w:pPr>
+              <w:spacing w:after="0" w:before="0" w:line="275"/>
+            </w:pPr>
+            <w:r>
+              <w:rPr>
+                <w:rFonts w:ascii="Calibri" w:cs="Calibri" w:eastAsia="Calibri" w:hAnsi="Calibri"/>
+                <w:b w:val="false"/>
+                <w:bCs w:val="false"/>
+                <w:color w:val="111827"/>
+                <w:sz w:val="20"/>
+                <w:szCs w:val="20"/>
+              </w:rPr>
+              <w:t xml:space="preserve">A trained mathematical system that uses learned parameters to process inputs and produce an output, such as a prediction, classification, or response.</w:t>
+            </w:r>
+          </w:p>
+        </w:tc>
+      </w:tr>
+      <w:tr>
+        <w:tc>
+          <w:tcPr>
+            <w:tcW w:type="dxa" w:w="2520"/>
+            <w:tcMar>
+              <w:top w:type="dxa" w:w="80"/>
+              <w:bottom w:type="dxa" w:w="80"/>
+            </w:tcMar>
+            <w:vAlign w:val="center"/>
+          </w:tcPr>
+          <w:p>
+            <w:pPr>
+              <w:spacing w:after="0" w:before="0" w:line="275"/>
+            </w:pPr>
+            <w:r>
+              <w:rPr>
+                <w:rFonts w:ascii="Calibri" w:cs="Calibri" w:eastAsia="Calibri" w:hAnsi="Calibri"/>
+                <w:b/>
+                <w:bCs/>
+                <w:color w:val="111827"/>
+                <w:sz w:val="20"/>
+                <w:szCs w:val="20"/>
+              </w:rPr>
               <w:t xml:space="preserve">Multimodal AI</w:t>
             </w:r>
           </w:p>
@@ -1008,33 +1170,33 @@
                 <w:sz w:val="20"/>
                 <w:szCs w:val="20"/>
               </w:rPr>
-              <w:t xml:space="preserve">Parameter</w:t>
-            </w:r>
-          </w:p>
-        </w:tc>
-        <w:tc>
-          <w:tcPr>
-            <w:tcW w:type="dxa" w:w="6840"/>
-            <w:tcMar>
-              <w:top w:type="dxa" w:w="80"/>
-              <w:bottom w:type="dxa" w:w="80"/>
-            </w:tcMar>
-            <w:vAlign w:val="center"/>
-          </w:tcPr>
-          <w:p>
-            <w:pPr>
-              <w:spacing w:after="0" w:before="0" w:line="275"/>
-            </w:pPr>
-            <w:r>
-              <w:rPr>
-                <w:rFonts w:ascii="Calibri" w:cs="Calibri" w:eastAsia="Calibri" w:hAnsi="Calibri"/>
-                <w:b w:val="false"/>
-                <w:bCs w:val="false"/>
-                <w:color w:val="111827"/>
-                <w:sz w:val="20"/>
-                <w:szCs w:val="20"/>
-              </w:rPr>
-              <w:t xml:space="preserve">One of the internal adjustable values a model changes during training. Modern models can have billions of parameters.</w:t>
+              <w:t xml:space="preserve">Parameters</w:t>
+            </w:r>
+          </w:p>
+        </w:tc>
+        <w:tc>
+          <w:tcPr>
+            <w:tcW w:type="dxa" w:w="6840"/>
+            <w:tcMar>
+              <w:top w:type="dxa" w:w="80"/>
+              <w:bottom w:type="dxa" w:w="80"/>
+            </w:tcMar>
+            <w:vAlign w:val="center"/>
+          </w:tcPr>
+          <w:p>
+            <w:pPr>
+              <w:spacing w:after="0" w:before="0" w:line="275"/>
+            </w:pPr>
+            <w:r>
+              <w:rPr>
+                <w:rFonts w:ascii="Calibri" w:cs="Calibri" w:eastAsia="Calibri" w:hAnsi="Calibri"/>
+                <w:b w:val="false"/>
+                <w:bCs w:val="false"/>
+                <w:color w:val="111827"/>
+                <w:sz w:val="20"/>
+                <w:szCs w:val="20"/>
+              </w:rPr>
+              <w:t xml:space="preserve">The internal adjustable values a model changes during training. Modern models can have billions of parameters.</w:t>
             </w:r>
           </w:p>
         </w:tc>
@@ -1575,6 +1737,60 @@
                 <w:szCs w:val="20"/>
               </w:rPr>
               <w:t xml:space="preserve">A list of numbers a computer uses to represent information so it can compare and work with it mathematically.</w:t>
+            </w:r>
+          </w:p>
+        </w:tc>
+      </w:tr>
+      <w:tr>
+        <w:tc>
+          <w:tcPr>
+            <w:tcW w:type="dxa" w:w="2520"/>
+            <w:tcMar>
+              <w:top w:type="dxa" w:w="80"/>
+              <w:bottom w:type="dxa" w:w="80"/>
+            </w:tcMar>
+            <w:vAlign w:val="center"/>
+          </w:tcPr>
+          <w:p>
+            <w:pPr>
+              <w:spacing w:after="0" w:before="0" w:line="275"/>
+            </w:pPr>
+            <w:r>
+              <w:rPr>
+                <w:rFonts w:ascii="Calibri" w:cs="Calibri" w:eastAsia="Calibri" w:hAnsi="Calibri"/>
+                <w:b/>
+                <w:bCs/>
+                <w:color w:val="111827"/>
+                <w:sz w:val="20"/>
+                <w:szCs w:val="20"/>
+              </w:rPr>
+              <w:t xml:space="preserve">Weighting</w:t>
+            </w:r>
+          </w:p>
+        </w:tc>
+        <w:tc>
+          <w:tcPr>
+            <w:tcW w:type="dxa" w:w="6840"/>
+            <w:tcMar>
+              <w:top w:type="dxa" w:w="80"/>
+              <w:bottom w:type="dxa" w:w="80"/>
+            </w:tcMar>
+            <w:vAlign w:val="center"/>
+          </w:tcPr>
+          <w:p>
+            <w:pPr>
+              <w:spacing w:after="0" w:before="0" w:line="275"/>
+            </w:pPr>
+            <w:r>
+              <w:rPr>
+                <w:rFonts w:ascii="Calibri" w:cs="Calibri" w:eastAsia="Calibri" w:hAnsi="Calibri"/>
+                <w:b w:val="false"/>
+                <w:bCs w:val="false"/>
+                <w:color w:val="111827"/>
+                <w:sz w:val="20"/>
+                <w:szCs w:val="20"/>
+              </w:rPr>
+              <w:t xml:space="preserve">The way an AI system gives some signals, relationships, or examples more influence than others when calculating an output. During training, models adjust internal weights to improve their predictions.</w:t>
             </w:r>
           </w:p>
         </w:tc>

</xml_diff>